<commit_message>
E7 fixed-1칩 6-seed: '무효(0/1)' 정정→전이구간(−117±252, 2/6) + 논문 v3.1 재프레임
- 1칩 seed{1-5} 신규 런(clean·single-TAG·2M·100k×5): s3 +275·s5 +108 양수
  → 단일 seed(42, −376)의 오도 확인, Table 2 각주로 정직 보고
- v3.1: 서론 재배열(홀덤=선택된 검증 환경, 사유 4개), Lemma 3(계열 φ(비용0)=0)
  본문 승격, Table 2 PURE 행+§5.3.1 md 동기화, 임계 '존재' 톤 정렬,
  VII 향후 연구(적용 3조건 + V2G·IoT 선언)
- fig1 재생성(1칩 n=6), docx 재빌드, 실험일지 33절 보강 2 + README E3/E7 표 갱신
- 후속 논문 MDP 설계서(후속_mdp설계_v2g_iot.md) + 후속연구.md §8 시리즈 로드맵

Co-Authored-By: Claude Fable 5 <noreply@anthropic.com>
</commit_message>
<xml_diff>
--- a/zca_theory/zca_vic_논문초안_v3.docx
+++ b/zca_theory/zca_vic_논문초안_v3.docx
@@ -118,7 +118,7 @@
           <w:w w:val="95"/>
           <w:spacing w:val="-9"/>
         </w:rPr>
-        <w:t>표 기반 Monte-Carlo(MC) 제어에서 각 행동의 보상을 그 행동의 투자액 비율로 배분하는 비례배분(proportional) 기여도 정형화는 분산을 줄이는 합리적 선택이나, 비용 0 행동(예: CHECK)의 credit이 매 에피소드 정확히 0이 되어 그 MC 고정점이 참값과 무관하게 0에 고정되는 구조적 병리 — 영-기여 흡수(zero-credit absorption, ZCA) — 를 남긴다. 본 연구는 이를 세 층위에서 다룬다. (이론) 최소 toy MDP에서 영-고정점과 그로 인한 양방향 오순위(참값이 음수인 체크의 과대평가 = 흡수, 참값이 양수인 체크의 과소평가 = 은폐)를 증명하고, 낙관적 초기화의 일시적 흡수와 질적으로 구별하며(영구·고정점≠참값), 해소에 필요한 임계 가상비용 ε_min을 유도한다. (실측) 2,048-셀 헤즈업 홀덤 봇에서 Q(CHECK)가 정확히 0으로 붕괴함을 관측하고(표준 MC는 −73~+120칩 분포), 그 정책적 결과가 수동화임을 행동 수준에서 보인다 — 턴 결정의 65%를 체크하는 소극 정책. (처방 실증) 임계 미달인 1칩 가상비용은 무효지만, 임계를 넘는 상수 5칩 이상이면 수동화가 풀리고(턴 소액 베팅 65%로 전환) 이 병리를 착취하던 미학습 상대(무작위 정책)에 대한 성능이 학습 seed 전반에서 회복된다(−318±123 → +1546±535 mbb/g, 0/6 → 6/6 양수). 결정시점 상수 비용 등 인과적으로 깨끗한 변형에서 재현되어 사후정보·구현 인공물 가설은 통제실험으로 배제하였다. 끝으로 이 효과가 일반화가 아님을 정직하게 보고한다 — 사전 고정한 비용으로 4종 미학습 상대에 검증한 결과 이득은 상대 의존적이며(콜링스테이션 상대는 소폭 손해), 효과는 단일 상대 학습 구성에 한정된다.</w:t>
+        <w:t>표 기반 Monte-Carlo(MC) 제어에서 각 행동의 보상을 그 행동의 투자액 비율로 배분하는 비례배분(proportional) 기여도 정형화는 분산을 줄이는 합리적 선택이나, 비용 0 행동(예: CHECK)의 credit이 매 에피소드 정확히 0이 되어 그 MC 고정점이 참값과 무관하게 0에 고정되는 구조적 병리 — 영-기여 흡수(zero-credit absorption, ZCA) — 를 남긴다. 본 연구는 이를 세 층위에서 다룬다. (이론) 최소 toy MDP에서 영-고정점과 그로 인한 양방향 오순위(참값이 음수인 체크의 과대평가 = 흡수, 참값이 양수인 체크의 과소평가 = 은폐)를 증명하고, 이 병리가 특정 배분식이 아니라 기여도-비례 배분 계열 전체(기여도 0 → credit 0)의 구조적 성질임을 보이며, 낙관적 초기화의 일시적 흡수와 질적으로 구별하고(영구·고정점≠참값), 해소에 필요한 임계 가상비용 ε_min을 유도한다. (실측) 2,048-셀 헤즈업 홀덤 봇에서 Q(CHECK)가 정확히 0으로 붕괴함을 관측하고(표준 MC는 −73~+120칩 분포), 그 정책적 결과가 수동화임을 행동 수준에서 보인다 — 턴 결정의 65%를 체크하는 소극 정책. (처방 실증) 1칩 가상비용은 회복을 재현하지 못하고 학습 seed에 따라 부호가 요동하지만(6-seed 평균 −117 mbb/g, 양수 2/6 — 전이구간), 임계를 넘는 상수 5칩 이상이면 수동화가 풀리고(턴 소액 베팅 65%로 전환) 이 병리를 착취하던 미학습 상대(무작위 정책)에 대한 성능이 학습 seed 전반에서 회복된다(−318±123 → +1546±535 mbb/g, 0/6 → 6/6 양수). 결정시점 상수 비용 등 인과적으로 깨끗한 변형에서 재현되어 사후정보·구현 인공물 가설은 통제실험으로 배제하였다. 끝으로 이 효과가 일반화가 아님을 정직하게 보고한다 — 사전 고정한 비용으로 4종 미학습 상대에 검증한 결과 이득은 상대 의존적이며(콜링스테이션 상대는 소폭 손해), 효과는 단일 상대 학습 구성에 한정된다.</w:t>
       </w:r>
     </w:p>
     <w:p>
@@ -247,7 +247,7 @@
           <w:w w:val="95"/>
           <w:spacing w:val="-9"/>
         </w:rPr>
-        <w:t>In tabular Monte-Carlo (MC) control, proportional credit assignment—sharing the terminal payoff in proportion to each action's invested chips—is a reasonable variance-reduction choice, but it leaves a structural pathology for zero-cost actions (e.g., CHECK): their credit is exactly zero every episode, pinning the MC fixed point at zero regardless of true value — Zero-Credit Absorption (ZCA). We treat this at three levels. (Theory) In a minimal toy MDP we prove the zero fixed point and the resulting bidirectional mis-ranking (overvaluing bad checks = absorption; undervaluing good checks = masking), distinguish it from the transient absorption of optimistic initialization, and derive the threshold virtual cost ε_min required to dissolve it. (Measurement) In a 2,048-cell heads-up hold'em agent, the learned Q(CHECK) collapses exactly to zero (vs. −73 to +120 chips under standard MC), and the policy consequence is passivity — checking 65% of turn decisions. (Remedy) A sub-threshold one-chip cost is ineffective, but a constant cost of five chips or more exceeds the threshold: passivity dissolves (65% small bets on the turn) and performance against the unseen opponent that exploited this pathology (a random policy) recovers across training seeds (−318±123 → +1546±535 mbb/g; 0/6 → 6/6 positive), reproducing under causally clean variants that rule out hindsight-information and implementation-artifact explanations. Finally, we honestly report that this is not generalization: with the cost fixed in advance, gains against four held-out opponents are opponent-dependent (a slight loss against a calling station), and the effect is confined to single-opponent training.</w:t>
+        <w:t>In tabular Monte-Carlo (MC) control, proportional credit assignment—sharing the terminal payoff in proportion to each action's invested chips—is a reasonable variance-reduction choice, but it leaves a structural pathology for zero-cost actions (e.g., CHECK): their credit is exactly zero every episode, pinning the MC fixed point at zero regardless of true value — Zero-Credit Absorption (ZCA). We treat this at three levels. (Theory) In a minimal toy MDP we prove the zero fixed point and the resulting bidirectional mis-ranking (overvaluing bad checks = absorption; undervaluing good checks = masking), show that the pathology is a structural property of the whole family of contribution-proportional schemes (zero contribution → zero credit), distinguish it from the transient absorption of optimistic initialization, and derive the threshold virtual cost ε_min required to dissolve it. (Measurement) In a 2,048-cell heads-up hold'em agent, the learned Q(CHECK) collapses exactly to zero (vs. −73 to +120 chips under standard MC), and the policy consequence is passivity — checking 65% of turn decisions. (Remedy) A one-chip cost fails to reproduce recovery, with its sign fluctuating across training seeds (mean −117 mbb/g, 2/6 positive — a transition zone), but a constant cost of five chips or more exceeds the threshold: passivity dissolves (65% small bets on the turn) and performance against the unseen opponent that exploited this pathology (a random policy) recovers across training seeds (−318±123 → +1546±535 mbb/g; 0/6 → 6/6 positive), reproducing under causally clean variants that rule out hindsight-information and implementation-artifact explanations. Finally, we honestly report that this is not generalization: with the cost fixed in advance, gains against four held-out opponents are opponent-dependent (a slight loss against a calling station), and the effect is confined to single-opponent training.</w:t>
       </w:r>
     </w:p>
     <w:p>
@@ -318,7 +318,7 @@
           <w:w w:val="95"/>
           <w:spacing w:val="-9"/>
         </w:rPr>
-        <w:t>표 기반 강화학습은 함수근사의 블랙박스 효과 없이 학습 동역학을 단일변수로 통제·관찰할 수 있다. 본 연구의 무대는 헤즈업 노리밋 홀덤을 순수 tabular Monte-Carlo로 학습하는 환경이며, 목적은 강한 봇이 아니라 구조적 기여도 배분이 남기는 측정 가능한 병리의 진단과, 그 병리를 해소하는 최소 개입의 임계 조건 규명이다.</w:t>
+        <w:t>본 연구의 대상은 특정 게임이 아니라 구조적 기여도 배분이 남기는 측정 가능한 병리의 진단과, 그 병리를 해소하는 최소 개입의 임계 조건 규명이다. 표 기반 강화학습은 함수근사의 블랙박스 효과 없이 학습 동역학을 단일변수로 통제·관찰할 수 있으므로, 검증 환경으로는 헤즈업 노리밋 홀덤의 순수 tabular Monte-Carlo 학습을 선택한다. 이 선택은 네 가지 성질 때문이다: ① 비용 0 행동(CHECK)이 게임 규칙 자체에 내장되어 있어 인위적 삽입이 아니고, ② 보상이 말단에서 크고 확률적으로 실현되며, ③ 판돈 규모가 궤적마다 변해 임계 희석(4장)까지 시험되고, ④ 병리(수동화)를 착취하는 상대를 계측기로 쓸 수 있다.</w:t>
       </w:r>
     </w:p>
     <w:p>
@@ -352,7 +352,7 @@
           <w:w w:val="95"/>
           <w:spacing w:val="-9"/>
         </w:rPr>
-        <w:t>본 논문의 기여는 다음과 같다. (1) 진단 — 위 현상을 영-기여 흡수(ZCA)로 명명해 toy MDP에서 양방향 오순위로 증명하고(3장), 실제 2,048-셀 봇에서 Q(CHECK)의 정확한 영-고정점과 그 정책적 결과(턴 결정의 65%를 체크하는 수동화)를 측정한다(5장). (2) 임계 이론과 실증 — 비용 0 행동에 가상비용 ε을 부여하면 고정점이 참값 방향으로 풀리며, 해소에 필요한 임계 ε_min을 유도하고(4장), 실제 시스템에서 임계 미달(1칩)은 무효·임계 초과(상수 5칩 이상)는 유효함을 학습 seed 전반에서 재현한다(5장) — 이론의 예측이 실험으로 확인된 사례다. (3) 정직한 범위 규정 — 이 회복이 "일반화"가 아니라 병리를 착취하던 상대에 대한 회복임을 사전 고정 비용의 홀드아웃 검증으로 보이고(콜링스테이션 상대는 소폭 손해), 평가에서 발견·정정한 구현 인공물과 단일 seed의 위험을 방법론적 부정적 결과로 보고한다(5·6장).</w:t>
+        <w:t>본 논문의 기여는 다음과 같다. (1) 진단 — 위 현상을 영-기여 흡수(ZCA)로 명명해 toy MDP에서 양방향 오순위로 증명하고, 이것이 특정 배분식의 결함이 아니라 기여도-비례 배분 계열 전체의 구조적 성질(기여도 함수가 비용 0 행동에 0을 주는 모든 방식 — Lemma 3)임을 보이며(3장), 실제 2,048-셀 에이전트에서 Q(CHECK)의 정확한 영-고정점과 그 정책적 결과(턴 결정의 65%를 체크하는 수동화)를 측정한다(5장). (2) 임계 이론과 실증 — 비용 0 행동에 가상비용 ε을 부여하면 고정점이 참값 방향으로 풀리며, 해소에 필요한 임계 ε_min을 유도하고(4장), 실제 시스템에서 1칩은 회복을 재현하지 못하고 부호가 seed에 따라 요동하며(전이구간)·임계를 충분히 넘는 상수 5칩 이상은 전 seed 유효함을 재현한다(5장) — 이론이 예측한 임계의 존재가 단조 용량-반응으로 확인된 사례다(임계의 위치까지 예측하는 것은 아니다 — 6장 한계 ①). 아울러 동일 예산의 표준 MC와 3자 비교로 처방의 실용적 가치 — 저분산 배분을 보존한 채 병리만 제거 — 를 분리한다(5.3.1절). (3) 정직한 범위 규정 — 이 회복이 "일반화"가 아니라 병리를 착취하던 상대에 대한 회복임을 사전 고정 비용의 홀드아웃 검증으로 보이고(콜링스테이션 상대는 소폭 손해), 평가에서 발견·정정한 구현 인공물과 단일 seed의 위험을 방법론적 부정적 결과로 보고한다(5·6장).</w:t>
       </w:r>
     </w:p>
     <w:p>
@@ -690,6 +690,23 @@
           <w:w w:val="95"/>
           <w:spacing w:val="-9"/>
         </w:rPr>
+        <w:t>Lemma 3 (계열 일반화). 임의의 기여도 함수 φ≥0에 대해 credit(a)=[φ(a)/Σφ]·P 꼴의 비례 credit은 φ(a)=0인 행동에서 Lemma 2와 동일한 영-고정점을 갖는다 — ZCA ⟺ φ(비용 0 행동)=0. 투자액(φ=inv)뿐 아니라 칩과 무관한 공격성 지표(φ=베팅 여부 1/0)에서도 재현되고, 균등 기여(φ≡1)와 표준 MC(return-equivalent)는 면역이다(수치 검증 스크립트 공개). 즉 ZCA는 본 연구가 채택한 특정 배분식의 결함이 아니라, null-player 공리(기여 0 → 배분 0)[3]를 가치 학습 신호로 쓰는 계열 전체의 구조적 함정이다.</w:t>
+      </w:r>
+    </w:p>
+    <w:p>
+      <w:pPr>
+        <w:spacing w:after="80" w:before="0" w:line="384" w:lineRule="auto"/>
+        <w:jc w:val="both"/>
+      </w:pPr>
+      <w:r>
+        <w:rPr>
+          <w:rFonts w:ascii="신명조" w:hAnsi="신명조" w:eastAsia="신명조"/>
+          <w:b w:val="0"/>
+          <w:i w:val="0"/>
+          <w:sz w:val="18"/>
+          <w:w w:val="95"/>
+          <w:spacing w:val="-9"/>
+        </w:rPr>
         <w:t>Theorem (흡수 — 나쁜 체크의 과대평가). μ_C &lt; μ_B &lt; 0이면 비례배분 greedy는 Q_prop(CHECK)=0 &gt; [b/(b+c)]μ_B이므로 열등한 CHECK를 선택한다(표준 MC는 최적 BET 선택).</w:t>
       </w:r>
     </w:p>
@@ -758,7 +775,7 @@
           <w:w w:val="95"/>
           <w:spacing w:val="-9"/>
         </w:rPr>
-        <w:t>Proposition 2 (해소 임계). CHECK에 가상 투자 ε&gt;0을 주면 Q_vic(CHECK)=[ε/(ε+c)]·μ_C로 고정점이 참값 방향으로 풀린다. 두 모드 공통으로, greedy가 참-우월 행동을 선택할 필요충분조건은 k:=[b/(b+c)](μ_B/μ_C)∈(0,1)에 대해  ε &gt; ε_min = k·c/(1−k)  이다(흡수·은폐 모드에서 동형; 수치 검증 일치). 임계 미달이면 Q_vic(CHECK)≈0으로 오순위가 잔존한다 — 이 예측이 5장에서 "1칩 무효, 5칩 이상 유효"로 확인된다. 팟 규모 c가 궤적마다 변하는 환경에서는 고정 소액 ε이 큰 팟에서 희석되므로(ε/(ε+c)→0), 임계는 대표 팟 규모 기준으로 설정해야 한다.</w:t>
+        <w:t>Proposition 2 (해소 임계). CHECK에 가상 투자 ε&gt;0을 주면 Q_vic(CHECK)=[ε/(ε+c)]·μ_C로 고정점이 참값 방향으로 풀린다. 두 모드 공통으로, greedy가 참-우월 행동을 선택할 필요충분조건은 k:=[b/(b+c)](μ_B/μ_C)∈(0,1)에 대해  ε &gt; ε_min = k·c/(1−k)  이다(흡수·은폐 모드에서 동형; 수치 검증 일치). 임계 미달이면 Q_vic(CHECK)≈0으로 오순위가 잔존한다 — 이 예측이 5장에서 "1칩은 회복 재현 실패(부호 요동), 5칩 이상 전 seed 유효"로 확인된다. 팟 규모 c가 궤적마다 변하는 환경에서는 고정 소액 ε이 큰 팟에서 희석되므로(ε/(ε+c)→0), 임계는 대표 팟 규모 기준으로 설정해야 한다. 나아가 결정 상태(셀)마다 팟 규모가 달라 ε_min도 셀마다 다르므로, 고정 ε이 일부 셀에서만 임계를 넘는 중간 크기에서는 부분적·seed 의존적 회복(전이구간)이 예상된다 — 5장에서 1칩이 정확히 이 양상을 보인다.</w:t>
       </w:r>
     </w:p>
     <w:p>
@@ -894,7 +911,7 @@
           <w:w w:val="95"/>
           <w:spacing w:val="-10"/>
         </w:rPr>
-        <w:t>5.3 임계 실증 — 1칩은 무효, 5칩 이상은 유효</w:t>
+        <w:t>5.3 임계 실증 — 1칩은 전이구간, 5칩 이상은 유효</w:t>
       </w:r>
     </w:p>
     <w:p>
@@ -911,7 +928,7 @@
           <w:w w:val="95"/>
           <w:spacing w:val="-9"/>
         </w:rPr>
-        <w:t>가상비용의 크기를 단일변수로 스윕한 결과(&lt;Table 2&gt;), Proposition 2의 예측대로 임계 미달 개입은 무효, 임계 초과 개입은 유효하다.</w:t>
+        <w:t>가상비용의 크기를 단일변수로 스윕한 결과(&lt;Table 2&gt;), Proposition 2의 예측과 정합하게 용량-반응이 단조하며, 임계를 충분히 넘는 개입에서만 전 seed 양수가 된다.</w:t>
       </w:r>
     </w:p>
     <w:p>
@@ -1053,6 +1070,96 @@
                 <w:w w:val="95"/>
                 <w:spacing w:val="-8"/>
               </w:rPr>
+              <w:t>(참조) 표준 MC — 배분 제거</w:t>
+            </w:r>
+          </w:p>
+        </w:tc>
+        <w:tc>
+          <w:tcPr>
+            <w:tcW w:type="dxa" w:w="2160"/>
+          </w:tcPr>
+          <w:p>
+            <w:pPr>
+              <w:spacing w:line="276" w:lineRule="auto"/>
+              <w:jc w:val="center"/>
+            </w:pPr>
+            <w:r>
+              <w:rPr>
+                <w:rFonts w:ascii="신명조" w:hAnsi="신명조" w:eastAsia="신명조"/>
+                <w:b w:val="0"/>
+                <w:i w:val="0"/>
+                <w:sz w:val="17"/>
+                <w:w w:val="95"/>
+                <w:spacing w:val="-8"/>
+              </w:rPr>
+              <w:t>−312±91</w:t>
+            </w:r>
+          </w:p>
+        </w:tc>
+        <w:tc>
+          <w:tcPr>
+            <w:tcW w:type="dxa" w:w="2160"/>
+          </w:tcPr>
+          <w:p>
+            <w:pPr>
+              <w:spacing w:line="276" w:lineRule="auto"/>
+              <w:jc w:val="center"/>
+            </w:pPr>
+            <w:r>
+              <w:rPr>
+                <w:rFonts w:ascii="신명조" w:hAnsi="신명조" w:eastAsia="신명조"/>
+                <w:b w:val="0"/>
+                <w:i w:val="0"/>
+                <w:sz w:val="17"/>
+                <w:w w:val="95"/>
+                <w:spacing w:val="-8"/>
+              </w:rPr>
+              <w:t>0/5</w:t>
+            </w:r>
+          </w:p>
+        </w:tc>
+        <w:tc>
+          <w:tcPr>
+            <w:tcW w:type="dxa" w:w="2160"/>
+          </w:tcPr>
+          <w:p>
+            <w:pPr>
+              <w:spacing w:line="276" w:lineRule="auto"/>
+              <w:jc w:val="center"/>
+            </w:pPr>
+            <w:r>
+              <w:rPr>
+                <w:rFonts w:ascii="신명조" w:hAnsi="신명조" w:eastAsia="신명조"/>
+                <w:b w:val="0"/>
+                <w:i w:val="0"/>
+                <w:sz w:val="17"/>
+                <w:w w:val="95"/>
+                <w:spacing w:val="-8"/>
+              </w:rPr>
+              <w:t>병리 없음·양 지표 열세(5.3.1절)</w:t>
+            </w:r>
+          </w:p>
+        </w:tc>
+      </w:tr>
+      <w:tr>
+        <w:tc>
+          <w:tcPr>
+            <w:tcW w:type="dxa" w:w="2160"/>
+          </w:tcPr>
+          <w:p>
+            <w:pPr>
+              <w:spacing w:line="276" w:lineRule="auto"/>
+              <w:jc w:val="center"/>
+            </w:pPr>
+            <w:r>
+              <w:rPr>
+                <w:rFonts w:ascii="신명조" w:hAnsi="신명조" w:eastAsia="신명조"/>
+                <w:b w:val="0"/>
+                <w:i w:val="0"/>
+                <w:sz w:val="17"/>
+                <w:w w:val="95"/>
+                <w:spacing w:val="-8"/>
+              </w:rPr>
               <w:t>없음 (ε=0)</w:t>
             </w:r>
           </w:p>
@@ -1165,7 +1272,7 @@
                 <w:w w:val="95"/>
                 <w:spacing w:val="-8"/>
               </w:rPr>
-              <w:t>−376</w:t>
+              <w:t>−117±252</w:t>
             </w:r>
           </w:p>
         </w:tc>
@@ -1187,7 +1294,7 @@
                 <w:w w:val="95"/>
                 <w:spacing w:val="-8"/>
               </w:rPr>
-              <w:t>0/1¹</w:t>
+              <w:t>2/6¹</w:t>
             </w:r>
           </w:p>
         </w:tc>
@@ -1209,7 +1316,7 @@
                 <w:w w:val="95"/>
                 <w:spacing w:val="-8"/>
               </w:rPr>
-              <w:t>임계 미달 — 무효</w:t>
+              <w:t>전이구간 — 평균 음수·부호 요동</w:t>
             </w:r>
           </w:p>
         </w:tc>
@@ -1685,7 +1792,7 @@
           <w:w w:val="95"/>
           <w:spacing w:val="-9"/>
         </w:rPr>
-        <w:t>¹ 1칩 조건은 단일 seed — 단 5칩 이상과의 대비는 이론 예측과 정합. 조건별 분포는 &lt;Figure 1&gt;과 같다. 행동 수준에서 임계 초과 개입은 수동화를 정확히 뒤집는다(&lt;Figure 3&gt;) — 턴 체크 65% → 턴 소액 베팅 65%, 승률 51.8→54.5%, 평균 승리 팟 +19.9→+25.3칩. 즉 Q(CHECK)가 참값(무작위 상대에게 턴 체크는 지분 포기 = 음수)을 학습하자 greedy가 베팅으로 전환한 것이다. 결정시점 상수 비용(fixed-K)에서 재현되므로 사후정보(최종 팟 사용) 가설은 배제되고, 이론(결정시점 상수 ε)과 정확히 대응한다.</w:t>
+        <w:t>¹ 1칩 조건의 초기 단일 seed(42) 측정은 −376으로 "무효"를 시사했으나, 6-seed 확장에서 부호 요동(2/6 양수)이 드러났다 — 단일 seed의 오도 위험(6장)의 추가 사례이며, 셀별 임계 이질성에 의한 전이구간 해석(4장)과 정합한다. 조건별 분포는 &lt;Figure 1&gt;과 같다. 행동 수준에서 임계 초과 개입은 수동화를 정확히 뒤집는다(&lt;Figure 3&gt;) — 턴 체크 65% → 턴 소액 베팅 65%, 승률 51.8→54.5%, 평균 승리 팟 +19.9→+25.3칩. 즉 Q(CHECK)가 참값(무작위 상대에게 턴 체크는 지분 포기 = 음수)을 학습하자 greedy가 베팅으로 전환한 것이다. 결정시점 상수 비용(fixed-K)에서 재현되므로 사후정보(최종 팟 사용) 가설은 배제되고, 이론(결정시점 상수 ε)과 정확히 대응한다.</w:t>
       </w:r>
     </w:p>
     <w:p>
@@ -2265,7 +2372,7 @@
           <w:w w:val="95"/>
           <w:spacing w:val="-9"/>
         </w:rPr>
-        <w:t>(2) 한계. ① 임계의 정확한 위치는 미확정 — 전이구간(팟 8~15%·1~5칩 사이)은 seed 요동이 커 "임계 미달 무효/충분 초과 유효"의 존재만 주장한다. ② 효과의 범위는 단일 상대 학습·단일 게임(HUNL)·단일 추상화에 한정된다. ③ 홀드아웃 상대도 자작 룰 정책이며 외부·균형 상대(예: 근사 GTO)에 대한 검증은 향후 과제다. ④ ZCA의 부품(null-player 공리·return-equivalence·낙관적 초기화·PBRS≡Q-init)은 기지이며, 기여는 이들을 실패 모드로 재진단하고 임계를 유도·실증하며 범위를 정직히 규정한 데 있다.</w:t>
+        <w:t>(2) 한계. ① 임계의 정확한 위치는 미확정 — 전이구간(팟 8~15%·상수 1칩 부근)은 seed 요동이 크며(1칩 6-seed 평균 −117·2/6 양수), "충분 초과 시 전 seed 유효"라는 임계의 존재만 주장한다. ② 효과의 범위는 단일 상대 학습·단일 게임(HUNL)·단일 추상화에 한정된다. ③ 홀드아웃 상대도 자작 룰 정책이며 외부·균형 상대(예: 근사 GTO)에 대한 검증은 향후 과제다. ④ ZCA의 부품(null-player 공리·return-equivalence·낙관적 초기화·PBRS≡Q-init)은 기지이며, 기여는 이들을 실패 모드로 재진단하고 임계를 유도·실증하며 범위를 정직히 규정한 데 있다.</w:t>
       </w:r>
     </w:p>
     <w:p>
@@ -2282,7 +2389,24 @@
           <w:w w:val="95"/>
           <w:spacing w:val="-12"/>
         </w:rPr>
-        <w:t>7. 결론</w:t>
+        <w:t>7. 결론 및 향후 연구</w:t>
+      </w:r>
+    </w:p>
+    <w:p>
+      <w:pPr>
+        <w:spacing w:after="120" w:before="0" w:line="384" w:lineRule="auto"/>
+        <w:jc w:val="both"/>
+      </w:pPr>
+      <w:r>
+        <w:rPr>
+          <w:rFonts w:ascii="신명조" w:hAnsi="신명조" w:eastAsia="신명조"/>
+          <w:b w:val="0"/>
+          <w:i w:val="0"/>
+          <w:sz w:val="18"/>
+          <w:w w:val="95"/>
+          <w:spacing w:val="-9"/>
+        </w:rPr>
+        <w:t>비례배분 기여도는 비용 0 행동에 구조적 영-고정점(ZCA)을 남기고, 이는 행동 순위를 양방향으로 왜곡하며(흡수·은폐), 낙관적 초기화의 일시적 0-선호와 달리 방문으로 해소되지 않는다 — 이상을 toy MDP에서 증명하고 실제 2,048-셀 에이전트에서 Q(CHECK)=0의 정확한 붕괴와 그 결과인 정책 수동화(턴 체크 65%)로 실측하였다. 유도한 임계 조건의 예측은 단조 용량-반응으로 확인되었다: 무개입은 전 seed 음수(0/6), 1칩은 부호가 요동하는 전이구간(2/6), 상수 5칩 이상이면 수동화가 풀리고(턴 소액 베팅 65%) 병리를 착취하던 미학습 상대에 대한 성능이 학습 seed 전반에서 회복된다(5/5·6/6 양수). 확인된 것은 임계의 존재이며 위치의 예측이 아니다(6장 한계 ①). 사후정보·구현 인공물·평가 순환성 가설은 각각 결정시점 상수 비용, 격리 실험, 사전 고정 홀드아웃으로 배제하였고, "표준 MC를 쓰면 된다"는 대안은 동일 예산 3자 비교(양 지표 열세)로 기각하였다. 동시에 이 회복이 일반화가 아니라 상대 의존적 스타일 변화임을 — 콜링스테이션 상대의 소폭 손해까지 — 정직하게 보고하였다. 본 사례연구의 가치는, 구조적 기여도 배분의 병리를 증명·측정하고, 처방의 작동 조건(임계)을 이론-실험 대응으로 규명하며, 그 한계를 부정적 결과와 함께 드러낸 데 있다.</w:t>
       </w:r>
     </w:p>
     <w:p>
@@ -2299,7 +2423,7 @@
           <w:w w:val="95"/>
           <w:spacing w:val="-9"/>
         </w:rPr>
-        <w:t>비례배분 기여도는 비용 0 행동에 구조적 영-고정점(ZCA)을 남기고, 이는 행동 순위를 양방향으로 왜곡하며(흡수·은폐), 낙관적 초기화의 일시적 0-선호와 달리 방문으로 해소되지 않는다 — 이상을 toy MDP에서 증명하고 실제 2,048-셀 봇에서 Q(CHECK)=0의 정확한 붕괴와 그 결과인 정책 수동화(턴 체크 65%)로 실측하였다. 유도한 임계 가상비용 조건은 실험으로 확인되었다: 임계 미달 1칩은 무효, 상수 5칩 이상이면 수동화가 풀리고(턴 소액 베팅 65%) 병리를 착취하던 미학습 상대에 대한 성능이 학습 seed 전반에서 회복된다(0/6 → 6/6 양수). 사후정보·구현 인공물·평가 순환성 가설은 각각 결정시점 상수 비용, 격리 실험, 사전 고정 홀드아웃으로 배제하였다. 동시에 이 회복이 일반화가 아니라 상대 의존적 스타일 변화임을 — 콜링스테이션 상대의 소폭 손해까지 — 정직하게 보고하였다. 본 사례연구의 가치는, 구조적 기여도 배분의 병리를 증명·측정하고, 처방의 작동 조건(임계)을 이론-실험 대응으로 규명하며, 그 한계를 부정적 결과와 함께 드러낸 데 있다.</w:t>
+        <w:t>향후 연구. ZCA의 발생 조건은 게임 특수적이지 않다 — ① 성과가 말단에 한 번 실현되고, ② 행동이 성과와 같은 단위의 자원 투입이며, ③ 투입 0 행동이 존재하는 순차 결정 환경이면 계열 정리(Lemma 3)가 동일 병리의 발생을 예측한다. 이 세 조건은 예컨대 V2G 충·방전 스케줄링(대기 행동의 투입 0, 청구 주기 말 요금)과 에너지 하베스팅 IoT 전송 스케줄링(sleep 행동의 투입 0, 보고 주기 말 효용)에서 성립한다. 두 환경에서의 검증 — 특히 요금 구조가 균질한 V2G에서의 임계 위치 사전 계산, sleep의 대기전력이라는 실재 비용에 의한 가상비용의 물리적 해석 — 을 후속 연구로 진행한다.</w:t>
       </w:r>
     </w:p>
     <w:p>

</xml_diff>